<commit_message>
Add Siemens and Honeywell CCC to the equipment and vendor listings
Names Siemens among the compressor OEMs and Honeywell CCC as the anti-surge
and turbomachinery control system, in the profile, the competency table and
the equipment portfolio. Tightened Word paragraph spacing so both variants
stay at three pages.

Co-Authored-By: Claude Opus 5 <noreply@anthropic.com>
Claude-Session: https://claude.ai/code/session_013H3AMzMWzEerJx7AeqeVQp
</commit_message>
<xml_diff>
--- a/AZODO_EMEKA_CV_Rotating_Equipment_Engineer_QatarEnergyLNG_no_passport.docx
+++ b/AZODO_EMEKA_CV_Rotating_Equipment_Engineer_QatarEnergyLNG_no_passport.docx
@@ -95,7 +95,7 @@
     <w:p>
       <w:pPr>
         <w:shd w:val="clear" w:color="auto" w:fill="12304F"/>
-        <w:spacing w:before="100" w:after="40" w:line="240" w:lineRule="auto"/>
+        <w:spacing w:before="80" w:after="30" w:line="240" w:lineRule="auto"/>
       </w:pPr>
       <w:r>
         <w:rPr>
@@ -110,7 +110,7 @@
     </w:p>
     <w:p>
       <w:pPr>
-        <w:spacing w:before="0" w:after="50" w:line="240" w:lineRule="auto"/>
+        <w:spacing w:before="0" w:after="40" w:line="240" w:lineRule="auto"/>
         <w:jc w:val="both"/>
       </w:pPr>
       <w:r>
@@ -241,7 +241,7 @@
           <w:color w:val="1A1A1A"/>
           <w:sz w:val="18"/>
         </w:rPr>
-        <w:t xml:space="preserve"> of new machinery. Established liaison with OEMs and vendors (Solar Turbines, GE and compressor packagers). Strong working knowledge of </w:t>
+        <w:t xml:space="preserve"> of new machinery. Established liaison with OEMs and vendors (Solar Turbines, GE, Siemens and Honeywell CCC). Strong working knowledge of </w:t>
       </w:r>
       <w:r>
         <w:rPr>
@@ -267,7 +267,7 @@
     <w:p>
       <w:pPr>
         <w:shd w:val="clear" w:color="auto" w:fill="12304F"/>
-        <w:spacing w:before="100" w:after="40" w:line="240" w:lineRule="auto"/>
+        <w:spacing w:before="80" w:after="30" w:line="240" w:lineRule="auto"/>
       </w:pPr>
       <w:r>
         <w:rPr>
@@ -343,7 +343,7 @@
                 <w:color w:val="1A1A1A"/>
                 <w:sz w:val="17"/>
               </w:rPr>
-              <w:t>Centrifugal gas compressors (HP/LP, recompressors) • Turbo-expander/compressor trains • Industrial gas turbines (Solar Taurus/Centaur, GE Frame 9E) • Steam turbines • API 610 centrifugal &amp; cryogenic pumps • Diesel engines / firewater packages • Screw &amp; reciprocating air compressors • Dry gas &amp; mechanical seals, journal/thrust bearings, couplings, lube-oil and seal-gas systems</w:t>
+              <w:t>Centrifugal gas compressors (HP/LP, recompressors — Siemens, GE) • Turbo-expander/compressor trains • Industrial gas turbines (Solar Taurus/Centaur, GE Frame 9E) • Steam turbines • API 610 centrifugal &amp; cryogenic pumps • Diesel engines / firewater packages • Screw &amp; reciprocating air compressors • Dry gas &amp; mechanical seals, journal/thrust bearings, couplings, lube-oil and seal-gas systems</w:t>
             </w:r>
           </w:p>
         </w:tc>
@@ -427,7 +427,7 @@
                 <w:color w:val="1A1A1A"/>
                 <w:sz w:val="17"/>
               </w:rPr>
-              <w:t>SolarInsight • Seeq • PI / PI XHQ historian &amp; dashboards • SAP PM (notifications, work orders, strategy) • CMMS/EAM data quality • IIoT sensor-to-cloud (Modbus, OPC-UA) • Python/analytics and AI-assisted failure prediction</w:t>
+              <w:t>SolarInsight • Seeq • PI / PI XHQ historian &amp; dashboards • Honeywell CCC anti-surge and turbomachinery control • SAP PM (notifications, work orders, strategy) • CMMS/EAM data quality • IIoT sensor-to-cloud (Modbus, OPC-UA) • Python/analytics and AI-assisted failure prediction</w:t>
             </w:r>
           </w:p>
         </w:tc>
@@ -604,7 +604,7 @@
     <w:p>
       <w:pPr>
         <w:shd w:val="clear" w:color="auto" w:fill="12304F"/>
-        <w:spacing w:before="100" w:after="40" w:line="240" w:lineRule="auto"/>
+        <w:spacing w:before="80" w:after="30" w:line="240" w:lineRule="auto"/>
       </w:pPr>
       <w:r>
         <w:rPr>
@@ -728,7 +728,7 @@
     </w:p>
     <w:p>
       <w:pPr>
-        <w:spacing w:before="0" w:after="50" w:line="240" w:lineRule="auto"/>
+        <w:spacing w:before="0" w:after="40" w:line="240" w:lineRule="auto"/>
         <w:jc w:val="both"/>
       </w:pPr>
       <w:r>
@@ -764,7 +764,7 @@
     </w:p>
     <w:p>
       <w:pPr>
-        <w:spacing w:before="100" w:after="20" w:line="240" w:lineRule="auto"/>
+        <w:spacing w:before="80" w:after="20" w:line="240" w:lineRule="auto"/>
       </w:pPr>
       <w:r>
         <w:rPr>
@@ -780,7 +780,7 @@
     <w:p>
       <w:pPr>
         <w:pStyle w:val="ListBullet"/>
-        <w:spacing w:before="0" w:after="30" w:line="240" w:lineRule="auto"/>
+        <w:spacing w:before="0" w:after="24" w:line="240" w:lineRule="auto"/>
         <w:ind w:left="283"/>
         <w:jc w:val="both"/>
       </w:pPr>
@@ -818,7 +818,7 @@
     <w:p>
       <w:pPr>
         <w:pStyle w:val="ListBullet"/>
-        <w:spacing w:before="0" w:after="30" w:line="240" w:lineRule="auto"/>
+        <w:spacing w:before="0" w:after="24" w:line="240" w:lineRule="auto"/>
         <w:ind w:left="283"/>
         <w:jc w:val="both"/>
       </w:pPr>
@@ -856,7 +856,7 @@
     <w:p>
       <w:pPr>
         <w:pStyle w:val="ListBullet"/>
-        <w:spacing w:before="0" w:after="30" w:line="240" w:lineRule="auto"/>
+        <w:spacing w:before="0" w:after="24" w:line="240" w:lineRule="auto"/>
         <w:ind w:left="283"/>
         <w:jc w:val="both"/>
       </w:pPr>
@@ -874,7 +874,7 @@
     <w:p>
       <w:pPr>
         <w:pStyle w:val="ListBullet"/>
-        <w:spacing w:before="0" w:after="30" w:line="240" w:lineRule="auto"/>
+        <w:spacing w:before="0" w:after="24" w:line="240" w:lineRule="auto"/>
         <w:ind w:left="283"/>
         <w:jc w:val="both"/>
       </w:pPr>
@@ -911,7 +911,7 @@
     </w:p>
     <w:p>
       <w:pPr>
-        <w:spacing w:before="100" w:after="20" w:line="240" w:lineRule="auto"/>
+        <w:spacing w:before="80" w:after="20" w:line="240" w:lineRule="auto"/>
       </w:pPr>
       <w:r>
         <w:rPr>
@@ -927,7 +927,7 @@
     <w:p>
       <w:pPr>
         <w:pStyle w:val="ListBullet"/>
-        <w:spacing w:before="0" w:after="30" w:line="240" w:lineRule="auto"/>
+        <w:spacing w:before="0" w:after="24" w:line="240" w:lineRule="auto"/>
         <w:ind w:left="283"/>
         <w:jc w:val="both"/>
       </w:pPr>
@@ -955,7 +955,7 @@
     <w:p>
       <w:pPr>
         <w:pStyle w:val="ListBullet"/>
-        <w:spacing w:before="0" w:after="30" w:line="240" w:lineRule="auto"/>
+        <w:spacing w:before="0" w:after="24" w:line="240" w:lineRule="auto"/>
         <w:ind w:left="283"/>
         <w:jc w:val="both"/>
       </w:pPr>
@@ -983,7 +983,7 @@
     <w:p>
       <w:pPr>
         <w:pStyle w:val="ListBullet"/>
-        <w:spacing w:before="0" w:after="30" w:line="240" w:lineRule="auto"/>
+        <w:spacing w:before="0" w:after="24" w:line="240" w:lineRule="auto"/>
         <w:ind w:left="283"/>
         <w:jc w:val="both"/>
       </w:pPr>
@@ -1031,7 +1031,7 @@
     <w:p>
       <w:pPr>
         <w:pStyle w:val="ListBullet"/>
-        <w:spacing w:before="0" w:after="30" w:line="240" w:lineRule="auto"/>
+        <w:spacing w:before="0" w:after="24" w:line="240" w:lineRule="auto"/>
         <w:ind w:left="283"/>
         <w:jc w:val="both"/>
       </w:pPr>
@@ -1079,7 +1079,7 @@
     <w:p>
       <w:pPr>
         <w:pStyle w:val="ListBullet"/>
-        <w:spacing w:before="0" w:after="30" w:line="240" w:lineRule="auto"/>
+        <w:spacing w:before="0" w:after="24" w:line="240" w:lineRule="auto"/>
         <w:ind w:left="283"/>
         <w:jc w:val="both"/>
       </w:pPr>
@@ -1107,7 +1107,7 @@
     <w:p>
       <w:pPr>
         <w:pStyle w:val="ListBullet"/>
-        <w:spacing w:before="0" w:after="30" w:line="240" w:lineRule="auto"/>
+        <w:spacing w:before="0" w:after="24" w:line="240" w:lineRule="auto"/>
         <w:ind w:left="283"/>
         <w:jc w:val="both"/>
       </w:pPr>
@@ -1135,7 +1135,7 @@
     <w:p>
       <w:pPr>
         <w:pStyle w:val="ListBullet"/>
-        <w:spacing w:before="0" w:after="30" w:line="240" w:lineRule="auto"/>
+        <w:spacing w:before="0" w:after="24" w:line="240" w:lineRule="auto"/>
         <w:ind w:left="283"/>
         <w:jc w:val="both"/>
       </w:pPr>
@@ -1162,7 +1162,7 @@
     </w:p>
     <w:p>
       <w:pPr>
-        <w:spacing w:before="100" w:after="20" w:line="240" w:lineRule="auto"/>
+        <w:spacing w:before="80" w:after="20" w:line="240" w:lineRule="auto"/>
       </w:pPr>
       <w:r>
         <w:rPr>
@@ -1178,7 +1178,7 @@
     <w:p>
       <w:pPr>
         <w:pStyle w:val="ListBullet"/>
-        <w:spacing w:before="0" w:after="30" w:line="240" w:lineRule="auto"/>
+        <w:spacing w:before="0" w:after="24" w:line="240" w:lineRule="auto"/>
         <w:ind w:left="283"/>
         <w:jc w:val="both"/>
       </w:pPr>
@@ -1236,7 +1236,7 @@
     <w:p>
       <w:pPr>
         <w:pStyle w:val="ListBullet"/>
-        <w:spacing w:before="0" w:after="30" w:line="240" w:lineRule="auto"/>
+        <w:spacing w:before="0" w:after="24" w:line="240" w:lineRule="auto"/>
         <w:ind w:left="283"/>
         <w:jc w:val="both"/>
       </w:pPr>
@@ -1254,7 +1254,7 @@
     <w:p>
       <w:pPr>
         <w:pStyle w:val="ListBullet"/>
-        <w:spacing w:before="0" w:after="30" w:line="240" w:lineRule="auto"/>
+        <w:spacing w:before="0" w:after="24" w:line="240" w:lineRule="auto"/>
         <w:ind w:left="283"/>
         <w:jc w:val="both"/>
       </w:pPr>
@@ -1292,7 +1292,7 @@
     <w:p>
       <w:pPr>
         <w:pStyle w:val="ListBullet"/>
-        <w:spacing w:before="0" w:after="30" w:line="240" w:lineRule="auto"/>
+        <w:spacing w:before="0" w:after="24" w:line="240" w:lineRule="auto"/>
         <w:ind w:left="283"/>
         <w:jc w:val="both"/>
       </w:pPr>
@@ -1330,7 +1330,7 @@
     <w:p>
       <w:pPr>
         <w:pStyle w:val="ListBullet"/>
-        <w:spacing w:before="0" w:after="30" w:line="240" w:lineRule="auto"/>
+        <w:spacing w:before="0" w:after="24" w:line="240" w:lineRule="auto"/>
         <w:ind w:left="283"/>
         <w:jc w:val="both"/>
       </w:pPr>
@@ -1457,7 +1457,7 @@
     <w:p>
       <w:pPr>
         <w:pStyle w:val="ListBullet"/>
-        <w:spacing w:before="0" w:after="30" w:line="240" w:lineRule="auto"/>
+        <w:spacing w:before="0" w:after="24" w:line="240" w:lineRule="auto"/>
         <w:ind w:left="283"/>
         <w:jc w:val="both"/>
       </w:pPr>
@@ -1495,7 +1495,7 @@
     <w:p>
       <w:pPr>
         <w:pStyle w:val="ListBullet"/>
-        <w:spacing w:before="0" w:after="30" w:line="240" w:lineRule="auto"/>
+        <w:spacing w:before="0" w:after="24" w:line="240" w:lineRule="auto"/>
         <w:ind w:left="283"/>
         <w:jc w:val="both"/>
       </w:pPr>
@@ -1533,7 +1533,7 @@
     <w:p>
       <w:pPr>
         <w:pStyle w:val="ListBullet"/>
-        <w:spacing w:before="0" w:after="30" w:line="240" w:lineRule="auto"/>
+        <w:spacing w:before="0" w:after="24" w:line="240" w:lineRule="auto"/>
         <w:ind w:left="283"/>
         <w:jc w:val="both"/>
       </w:pPr>
@@ -1571,7 +1571,7 @@
     <w:p>
       <w:pPr>
         <w:pStyle w:val="ListBullet"/>
-        <w:spacing w:before="0" w:after="30" w:line="240" w:lineRule="auto"/>
+        <w:spacing w:before="0" w:after="24" w:line="240" w:lineRule="auto"/>
         <w:ind w:left="283"/>
         <w:jc w:val="both"/>
       </w:pPr>
@@ -1609,7 +1609,7 @@
     <w:p>
       <w:pPr>
         <w:pStyle w:val="ListBullet"/>
-        <w:spacing w:before="0" w:after="30" w:line="240" w:lineRule="auto"/>
+        <w:spacing w:before="0" w:after="24" w:line="240" w:lineRule="auto"/>
         <w:ind w:left="283"/>
         <w:jc w:val="both"/>
       </w:pPr>
@@ -1647,7 +1647,7 @@
     <w:p>
       <w:pPr>
         <w:pStyle w:val="ListBullet"/>
-        <w:spacing w:before="0" w:after="30" w:line="240" w:lineRule="auto"/>
+        <w:spacing w:before="0" w:after="24" w:line="240" w:lineRule="auto"/>
         <w:ind w:left="283"/>
         <w:jc w:val="both"/>
       </w:pPr>
@@ -1774,7 +1774,7 @@
     <w:p>
       <w:pPr>
         <w:pStyle w:val="ListBullet"/>
-        <w:spacing w:before="0" w:after="30" w:line="240" w:lineRule="auto"/>
+        <w:spacing w:before="0" w:after="24" w:line="240" w:lineRule="auto"/>
         <w:ind w:left="283"/>
         <w:jc w:val="both"/>
       </w:pPr>
@@ -1812,7 +1812,7 @@
     <w:p>
       <w:pPr>
         <w:pStyle w:val="ListBullet"/>
-        <w:spacing w:before="0" w:after="30" w:line="240" w:lineRule="auto"/>
+        <w:spacing w:before="0" w:after="24" w:line="240" w:lineRule="auto"/>
         <w:ind w:left="283"/>
         <w:jc w:val="both"/>
       </w:pPr>
@@ -1850,7 +1850,7 @@
     <w:p>
       <w:pPr>
         <w:pStyle w:val="ListBullet"/>
-        <w:spacing w:before="0" w:after="30" w:line="240" w:lineRule="auto"/>
+        <w:spacing w:before="0" w:after="24" w:line="240" w:lineRule="auto"/>
         <w:ind w:left="283"/>
         <w:jc w:val="both"/>
       </w:pPr>
@@ -1868,7 +1868,7 @@
     <w:p>
       <w:pPr>
         <w:pStyle w:val="ListBullet"/>
-        <w:spacing w:before="0" w:after="30" w:line="240" w:lineRule="auto"/>
+        <w:spacing w:before="0" w:after="24" w:line="240" w:lineRule="auto"/>
         <w:ind w:left="283"/>
         <w:jc w:val="both"/>
       </w:pPr>
@@ -1975,7 +1975,7 @@
     <w:p>
       <w:pPr>
         <w:pStyle w:val="ListBullet"/>
-        <w:spacing w:before="0" w:after="30" w:line="240" w:lineRule="auto"/>
+        <w:spacing w:before="0" w:after="24" w:line="240" w:lineRule="auto"/>
         <w:ind w:left="283"/>
         <w:jc w:val="both"/>
       </w:pPr>
@@ -1993,7 +1993,7 @@
     <w:p>
       <w:pPr>
         <w:pStyle w:val="ListBullet"/>
-        <w:spacing w:before="0" w:after="30" w:line="240" w:lineRule="auto"/>
+        <w:spacing w:before="0" w:after="24" w:line="240" w:lineRule="auto"/>
         <w:ind w:left="283"/>
         <w:jc w:val="both"/>
       </w:pPr>
@@ -2031,7 +2031,7 @@
     <w:p>
       <w:pPr>
         <w:pStyle w:val="ListBullet"/>
-        <w:spacing w:before="0" w:after="30" w:line="240" w:lineRule="auto"/>
+        <w:spacing w:before="0" w:after="24" w:line="240" w:lineRule="auto"/>
         <w:ind w:left="283"/>
         <w:jc w:val="both"/>
       </w:pPr>
@@ -2138,7 +2138,7 @@
     <w:p>
       <w:pPr>
         <w:pStyle w:val="ListBullet"/>
-        <w:spacing w:before="0" w:after="30" w:line="240" w:lineRule="auto"/>
+        <w:spacing w:before="0" w:after="24" w:line="240" w:lineRule="auto"/>
         <w:ind w:left="283"/>
         <w:jc w:val="both"/>
       </w:pPr>
@@ -2230,7 +2230,7 @@
     <w:p>
       <w:pPr>
         <w:pStyle w:val="ListBullet"/>
-        <w:spacing w:before="0" w:after="30" w:line="240" w:lineRule="auto"/>
+        <w:spacing w:before="0" w:after="24" w:line="240" w:lineRule="auto"/>
         <w:ind w:left="283"/>
         <w:jc w:val="both"/>
       </w:pPr>
@@ -2322,7 +2322,7 @@
     <w:p>
       <w:pPr>
         <w:pStyle w:val="ListBullet"/>
-        <w:spacing w:before="0" w:after="30" w:line="240" w:lineRule="auto"/>
+        <w:spacing w:before="0" w:after="24" w:line="240" w:lineRule="auto"/>
         <w:ind w:left="283"/>
         <w:jc w:val="both"/>
       </w:pPr>
@@ -2340,7 +2340,7 @@
     <w:p>
       <w:pPr>
         <w:shd w:val="clear" w:color="auto" w:fill="12304F"/>
-        <w:spacing w:before="100" w:after="40" w:line="240" w:lineRule="auto"/>
+        <w:spacing w:before="80" w:after="30" w:line="240" w:lineRule="auto"/>
       </w:pPr>
       <w:r>
         <w:rPr>
@@ -2504,7 +2504,7 @@
     <w:p>
       <w:pPr>
         <w:shd w:val="clear" w:color="auto" w:fill="12304F"/>
-        <w:spacing w:before="100" w:after="40" w:line="240" w:lineRule="auto"/>
+        <w:spacing w:before="80" w:after="30" w:line="240" w:lineRule="auto"/>
       </w:pPr>
       <w:r>
         <w:rPr>
@@ -2580,7 +2580,7 @@
                 <w:color w:val="1A1A1A"/>
                 <w:sz w:val="17"/>
               </w:rPr>
-              <w:t>Centrifugal HP gas compressors to 5,500+ psi (120 MMSCFD) • LP compressors 1,440+ psi (130 MMSCFD) • Recompressors • Screw and reciprocating air compressors • Anti-surge control, seal-gas and dry-gas seal systems</w:t>
+              <w:t>Centrifugal HP gas compressors to 5,500+ psi (120 MMSCFD) • LP compressors 1,440+ psi (130 MMSCFD) • Recompressors • Screw and reciprocating air compressors • Siemens compressor trains • Anti-surge and turbomachinery control (Honeywell CCC) • Seal-gas and dry-gas seal systems</w:t>
             </w:r>
           </w:p>
         </w:tc>
@@ -2715,7 +2715,7 @@
     <w:p>
       <w:pPr>
         <w:shd w:val="clear" w:color="auto" w:fill="12304F"/>
-        <w:spacing w:before="100" w:after="40" w:line="240" w:lineRule="auto"/>
+        <w:spacing w:before="80" w:after="30" w:line="240" w:lineRule="auto"/>
       </w:pPr>
       <w:r>
         <w:rPr>
@@ -3069,7 +3069,7 @@
     <w:p>
       <w:pPr>
         <w:shd w:val="clear" w:color="auto" w:fill="12304F"/>
-        <w:spacing w:before="100" w:after="40" w:line="240" w:lineRule="auto"/>
+        <w:spacing w:before="80" w:after="30" w:line="240" w:lineRule="auto"/>
       </w:pPr>
       <w:r>
         <w:rPr>
@@ -3299,7 +3299,7 @@
     <w:p>
       <w:pPr>
         <w:shd w:val="clear" w:color="auto" w:fill="12304F"/>
-        <w:spacing w:before="100" w:after="40" w:line="240" w:lineRule="auto"/>
+        <w:spacing w:before="80" w:after="30" w:line="240" w:lineRule="auto"/>
       </w:pPr>
       <w:r>
         <w:rPr>
@@ -3404,7 +3404,7 @@
     </w:tbl>
     <w:p>
       <w:pPr>
-        <w:spacing w:before="0" w:after="50" w:line="240" w:lineRule="auto"/>
+        <w:spacing w:before="0" w:after="40" w:line="240" w:lineRule="auto"/>
         <w:jc w:val="both"/>
       </w:pPr>
       <w:r>
@@ -3451,7 +3451,7 @@
     <w:sectPr>
       <w:footerReference w:type="default" r:id="rId9"/>
       <w:pgSz w:w="12240" w:h="15840"/>
-      <w:pgMar w:top="652" w:right="1020" w:bottom="652" w:left="1020" w:header="720" w:footer="720" w:gutter="0"/>
+      <w:pgMar w:top="595" w:right="1020" w:bottom="595" w:left="1020" w:header="720" w:footer="720" w:gutter="0"/>
       <w:cols w:space="720"/>
       <w:docGrid w:linePitch="360"/>
     </w:sectPr>

</xml_diff>

<commit_message>
Name OEMs and models in the rotating equipment portfolio
Regroups the portfolio by machine family — gas turbines, centrifugal
compressors, expanders and cryogenic pumps, pumps and auxiliaries — and names
each down to model: Siemens SGT-600, Solar Saturn 20/Centaur/Taurus 60/Mars
100, GE Frame 5 (MS5001), GE Frame 9E, Ansaldo GT13E2, the Siemens legacy
Dresser-Rand compressor family, and Cryostar and Ebara Cryodynamics cryogenic
pumps.

The page-1 competency row drops back to equipment classes and points to the
portfolio, so the detail lives in one place instead of two. Word cell type
size trimmed to hold three pages.

Co-Authored-By: Claude Opus 5 <noreply@anthropic.com>
Claude-Session: https://claude.ai/code/session_013H3AMzMWzEerJx7AeqeVQp
</commit_message>
<xml_diff>
--- a/AZODO_EMEKA_CV_Rotating_Equipment_Engineer_QatarEnergyLNG_no_passport.docx
+++ b/AZODO_EMEKA_CV_Rotating_Equipment_Engineer_QatarEnergyLNG_no_passport.docx
@@ -321,7 +321,7 @@
                 <w:b/>
                 <w:i w:val="0"/>
                 <w:color w:val="12304F"/>
-                <w:sz w:val="17"/>
+                <w:sz w:val="16"/>
               </w:rPr>
               <w:t>Rotating Equipment</w:t>
             </w:r>
@@ -341,9 +341,19 @@
                 <w:b w:val="0"/>
                 <w:i w:val="0"/>
                 <w:color w:val="1A1A1A"/>
-                <w:sz w:val="17"/>
+                <w:sz w:val="16"/>
               </w:rPr>
-              <w:t>Centrifugal gas compressors (HP/LP, recompressors — Siemens, GE) • Turbo-expander/compressor trains • Industrial gas turbines (Solar Taurus/Centaur, GE Frame 9E) • Steam turbines • API 610 centrifugal &amp; cryogenic pumps • Diesel engines / firewater packages • Screw &amp; reciprocating air compressors • Dry gas &amp; mechanical seals, journal/thrust bearings, couplings, lube-oil and seal-gas systems</w:t>
+              <w:t xml:space="preserve">Centrifugal gas compressors (HP/LP, recompressors) • Turbo-expander and booster-compressor trains • Industrial gas turbines • Steam turbines • API 610 centrifugal and cryogenic pumps • Diesel engine drivers • Screw and reciprocating air compressors • Dry-gas and mechanical seals, journal/thrust bearings, couplings, lube-oil and seal-gas systems </w:t>
+            </w:r>
+            <w:r>
+              <w:rPr>
+                <w:rFonts w:ascii="Calibri" w:hAnsi="Calibri"/>
+                <w:b/>
+                <w:i w:val="0"/>
+                <w:color w:val="1A1A1A"/>
+                <w:sz w:val="16"/>
+              </w:rPr>
+              <w:t>(OEMs and models listed on page 3)</w:t>
             </w:r>
           </w:p>
         </w:tc>
@@ -363,7 +373,7 @@
                 <w:b/>
                 <w:i w:val="0"/>
                 <w:color w:val="12304F"/>
-                <w:sz w:val="17"/>
+                <w:sz w:val="16"/>
               </w:rPr>
               <w:t>Health Assessment &amp; Surveillance</w:t>
             </w:r>
@@ -383,7 +393,7 @@
                 <w:b w:val="0"/>
                 <w:i w:val="0"/>
                 <w:color w:val="1A1A1A"/>
-                <w:sz w:val="17"/>
+                <w:sz w:val="16"/>
               </w:rPr>
               <w:t>Vibration analysis (ISO 10816/20816, Cat-I) • Lube-oil sampling, elemental &amp; particle-count analysis • Infrared thermography • Videoscope/borescope inspection • Performance monitoring via compressor maps, turbine heat rate and pump curves • Deviation flagging, trending and health reporting to stakeholders</w:t>
             </w:r>
@@ -405,7 +415,7 @@
                 <w:b/>
                 <w:i w:val="0"/>
                 <w:color w:val="12304F"/>
-                <w:sz w:val="17"/>
+                <w:sz w:val="16"/>
               </w:rPr>
               <w:t>Digital Tools &amp; Programs</w:t>
             </w:r>
@@ -425,7 +435,7 @@
                 <w:b w:val="0"/>
                 <w:i w:val="0"/>
                 <w:color w:val="1A1A1A"/>
-                <w:sz w:val="17"/>
+                <w:sz w:val="16"/>
               </w:rPr>
               <w:t>SolarInsight • Seeq • PI / PI XHQ historian &amp; dashboards • Honeywell CCC anti-surge and turbomachinery control • SAP PM (notifications, work orders, strategy) • CMMS/EAM data quality • IIoT sensor-to-cloud (Modbus, OPC-UA) • Python/analytics and AI-assisted failure prediction</w:t>
             </w:r>
@@ -447,7 +457,7 @@
                 <w:b/>
                 <w:i w:val="0"/>
                 <w:color w:val="12304F"/>
-                <w:sz w:val="17"/>
+                <w:sz w:val="16"/>
               </w:rPr>
               <w:t>Reliability &amp; Problem Solving</w:t>
             </w:r>
@@ -467,7 +477,7 @@
                 <w:b w:val="0"/>
                 <w:i w:val="0"/>
                 <w:color w:val="1A1A1A"/>
-                <w:sz w:val="17"/>
+                <w:sz w:val="16"/>
               </w:rPr>
               <w:t>Root Cause Failure Analysis (RCFA) • RCA (5-Why, Fishbone, Fault Tree) • FMEA / RCM • Bad-actor and MTBF analysis • Criticality ranking • Life-cycle cost • Reliability improvement and defect-elimination programmes</w:t>
             </w:r>
@@ -489,7 +499,7 @@
                 <w:b/>
                 <w:i w:val="0"/>
                 <w:color w:val="12304F"/>
-                <w:sz w:val="17"/>
+                <w:sz w:val="16"/>
               </w:rPr>
               <w:t>Projects, MOC &amp; Commissioning</w:t>
             </w:r>
@@ -509,7 +519,7 @@
                 <w:b w:val="0"/>
                 <w:i w:val="0"/>
                 <w:color w:val="1A1A1A"/>
-                <w:sz w:val="17"/>
+                <w:sz w:val="16"/>
               </w:rPr>
               <w:t>Technical review of vendor/engineering documents, data sheets and deviations • Machinery FAT/SAT witnessing • Pre-commissioning, commissioning and start-up support • PSSR development and execution • Brownfield modification and capacity-expansion support (120 → 240 MMSCFD)</w:t>
             </w:r>
@@ -531,7 +541,7 @@
                 <w:b/>
                 <w:i w:val="0"/>
                 <w:color w:val="12304F"/>
-                <w:sz w:val="17"/>
+                <w:sz w:val="16"/>
               </w:rPr>
               <w:t>Operations Interface &amp; HSE</w:t>
             </w:r>
@@ -551,7 +561,7 @@
                 <w:b w:val="0"/>
                 <w:i w:val="0"/>
                 <w:color w:val="1A1A1A"/>
-                <w:sz w:val="17"/>
+                <w:sz w:val="16"/>
               </w:rPr>
               <w:t>Operations/maintenance decision support • Shutdown &amp; turnaround scope optimisation • Risk assessment, HAZID/JSA participation • Permit to Work, LOTO, SIMOPS • OEM and vendor coordination • Multi-discipline technical support and mentoring</w:t>
             </w:r>
@@ -573,7 +583,7 @@
                 <w:b/>
                 <w:i w:val="0"/>
                 <w:color w:val="12304F"/>
-                <w:sz w:val="17"/>
+                <w:sz w:val="16"/>
               </w:rPr>
               <w:t>Standards</w:t>
             </w:r>
@@ -593,7 +603,7 @@
                 <w:b w:val="0"/>
                 <w:i w:val="0"/>
                 <w:color w:val="1A1A1A"/>
-                <w:sz w:val="17"/>
+                <w:sz w:val="16"/>
               </w:rPr>
               <w:t>API 610 (centrifugal pumps) • API 614 (lubrication, shaft-sealing and control-oil systems) • API 617 (axial and centrifugal compressors) • ASME PTC-22 (gas turbine performance testing) • ISO 10816 / 20816 (vibration evaluation)</w:t>
             </w:r>
@@ -2514,7 +2524,7 @@
           <w:color w:val="FFFFFF"/>
           <w:sz w:val="20"/>
         </w:rPr>
-        <w:t>ROTATING EQUIPMENT PORTFOLIO — HANDS-ON EXPERIENCE</w:t>
+        <w:t>ROTATING EQUIPMENT PORTFOLIO — OEMS &amp; MODELS SUPPORTED</w:t>
       </w:r>
     </w:p>
     <w:tbl>
@@ -2558,9 +2568,9 @@
                 <w:b/>
                 <w:i w:val="0"/>
                 <w:color w:val="12304F"/>
-                <w:sz w:val="17"/>
+                <w:sz w:val="16"/>
               </w:rPr>
-              <w:t>Compression</w:t>
+              <w:t>Gas Turbines</w:t>
             </w:r>
           </w:p>
         </w:tc>
@@ -2578,9 +2588,9 @@
                 <w:b w:val="0"/>
                 <w:i w:val="0"/>
                 <w:color w:val="1A1A1A"/>
-                <w:sz w:val="17"/>
+                <w:sz w:val="16"/>
               </w:rPr>
-              <w:t>Centrifugal HP gas compressors to 5,500+ psi (120 MMSCFD) • LP compressors 1,440+ psi (130 MMSCFD) • Recompressors • Screw and reciprocating air compressors • Siemens compressor trains • Anti-surge and turbomachinery control (Honeywell CCC) • Seal-gas and dry-gas seal systems</w:t>
+              <w:t>Siemens SGT-600 • Solar Saturn 20, Centaur, Taurus 60 and Mars 100 • GE Frame 5 (MS5001) • GE Frame 9E (MS9001E) combined cycle • Ansaldo / Alstom GT13E2 • Performance verification to ASME PTC-22; borescope, hot-section and mechanical maintenance support</w:t>
             </w:r>
           </w:p>
         </w:tc>
@@ -2600,9 +2610,9 @@
                 <w:b/>
                 <w:i w:val="0"/>
                 <w:color w:val="12304F"/>
-                <w:sz w:val="17"/>
+                <w:sz w:val="16"/>
               </w:rPr>
-              <w:t>Turbines &amp; Drivers</w:t>
+              <w:t>Centrifugal Compressors</w:t>
             </w:r>
           </w:p>
         </w:tc>
@@ -2620,9 +2630,9 @@
                 <w:b w:val="0"/>
                 <w:i w:val="0"/>
                 <w:color w:val="1A1A1A"/>
-                <w:sz w:val="17"/>
+                <w:sz w:val="16"/>
               </w:rPr>
-              <w:t>Solar Taurus 60 / Centaur gas turbine generators • GE Frame 9E combined cycle • Steam turbines (Egbin 1,320 MW station) • Diesel engine drivers for firewater and emergency generation • Electric motor drivers and gearboxes</w:t>
+              <w:t>Siemens legacy Dresser-Rand centrifugal compressor family • HP trains to 5,500+ psi (120 MMSCFD) and LP trains to 1,440+ psi (130 MMSCFD) • Recompressors • Anti-surge and turbomachinery control (Honeywell CCC) • Seal-gas, dry-gas seal and lube-oil systems</w:t>
             </w:r>
           </w:p>
         </w:tc>
@@ -2642,9 +2652,9 @@
                 <w:b/>
                 <w:i w:val="0"/>
                 <w:color w:val="12304F"/>
-                <w:sz w:val="17"/>
+                <w:sz w:val="16"/>
               </w:rPr>
-              <w:t>Expanders &amp; Cryogenics</w:t>
+              <w:t>Expanders &amp; Cryogenic Pumps</w:t>
             </w:r>
           </w:p>
         </w:tc>
@@ -2662,9 +2672,9 @@
                 <w:b w:val="0"/>
                 <w:i w:val="0"/>
                 <w:color w:val="1A1A1A"/>
-                <w:sz w:val="17"/>
+                <w:sz w:val="16"/>
               </w:rPr>
-              <w:t>Turbo-expander / booster-compressor trains • Cryogenic pumps • De-ethaniser, de-propaniser and de-butaniser NGL fractionation trains • Sales gas (C1/C2) export and NGL (C3+) export systems</w:t>
+              <w:t>Turbo-expander / booster-compressor trains • Cryogenic pumps — Cryostar and Ebara Cryodynamics (Elliott Ebara) • NGL fractionation: de-ethaniser, de-propaniser, de-butaniser • Sales gas (C1/C2) and NGL (C3+) export systems</w:t>
             </w:r>
           </w:p>
         </w:tc>
@@ -2684,9 +2694,9 @@
                 <w:b/>
                 <w:i w:val="0"/>
                 <w:color w:val="12304F"/>
-                <w:sz w:val="17"/>
+                <w:sz w:val="16"/>
               </w:rPr>
-              <w:t>Pumps &amp; Auxiliaries</w:t>
+              <w:t>Pumps, Drivers &amp; Auxiliaries</w:t>
             </w:r>
           </w:p>
         </w:tc>
@@ -2704,9 +2714,9 @@
                 <w:b w:val="0"/>
                 <w:i w:val="0"/>
                 <w:color w:val="1A1A1A"/>
-                <w:sz w:val="17"/>
+                <w:sz w:val="16"/>
               </w:rPr>
-              <w:t>API 610 centrifugal process pumps • Firewater pump packages and deliverability testing • Lube-oil and seal-oil consoles, run-down tanks, coolers and filtration • Mechanical and dry-gas seals, journal and thrust bearings, couplings</w:t>
+              <w:t>API 610 centrifugal process pumps • Firewater diesel engine packages and deliverability testing • Steam turbines (Egbin 1,320 MW station) • Screw and reciprocating air compressors • Electric motor drivers and gearboxes • Lube-oil and seal-oil consoles, run-down tanks, coolers, filtration • Bearings, couplings, mechanical seals</w:t>
             </w:r>
           </w:p>
         </w:tc>
@@ -2770,7 +2780,7 @@
                 <w:b w:val="0"/>
                 <w:i w:val="0"/>
                 <w:color w:val="1A1A1A"/>
-                <w:sz w:val="17"/>
+                <w:sz w:val="16"/>
               </w:rPr>
               <w:t>• ASQ Certified Reliability Engineer (CRE), 2024</w:t>
             </w:r>
@@ -2790,7 +2800,7 @@
                 <w:b w:val="0"/>
                 <w:i w:val="0"/>
                 <w:color w:val="1A1A1A"/>
-                <w:sz w:val="17"/>
+                <w:sz w:val="16"/>
               </w:rPr>
               <w:t>• Vibration Analysis Category I — Istec Academy, 2024</w:t>
             </w:r>
@@ -2810,7 +2820,7 @@
                 <w:b w:val="0"/>
                 <w:i w:val="0"/>
                 <w:color w:val="1A1A1A"/>
-                <w:sz w:val="17"/>
+                <w:sz w:val="16"/>
               </w:rPr>
               <w:t>• Reliability Engineering Principles — Beina M&amp;R, 2024</w:t>
             </w:r>
@@ -2832,7 +2842,7 @@
                 <w:b w:val="0"/>
                 <w:i w:val="0"/>
                 <w:color w:val="1A1A1A"/>
-                <w:sz w:val="17"/>
+                <w:sz w:val="16"/>
               </w:rPr>
               <w:t>• Gas Turbine Performance — Entropy-Tech, 2021</w:t>
             </w:r>
@@ -2852,7 +2862,7 @@
                 <w:b w:val="0"/>
                 <w:i w:val="0"/>
                 <w:color w:val="1A1A1A"/>
-                <w:sz w:val="17"/>
+                <w:sz w:val="16"/>
               </w:rPr>
               <w:t>• Gas Turbine Mechanical Maintenance — Masaood John Brown, 2018</w:t>
             </w:r>
@@ -2872,7 +2882,7 @@
                 <w:b w:val="0"/>
                 <w:i w:val="0"/>
                 <w:color w:val="1A1A1A"/>
-                <w:sz w:val="17"/>
+                <w:sz w:val="16"/>
               </w:rPr>
               <w:t>• Machinery Vibration Analysis &amp; Alignment — O-Secul, 2019</w:t>
             </w:r>
@@ -2894,7 +2904,7 @@
                 <w:b w:val="0"/>
                 <w:i w:val="0"/>
                 <w:color w:val="1A1A1A"/>
-                <w:sz w:val="17"/>
+                <w:sz w:val="16"/>
               </w:rPr>
               <w:t>• GE Frame 9E Combined Cycle — SEPCO-Pacific, 2015</w:t>
             </w:r>
@@ -2914,7 +2924,7 @@
                 <w:b w:val="0"/>
                 <w:i w:val="0"/>
                 <w:color w:val="1A1A1A"/>
-                <w:sz w:val="17"/>
+                <w:sz w:val="16"/>
               </w:rPr>
               <w:t>• BOSIET with CA-EBS — valid to 2029</w:t>
             </w:r>
@@ -2934,7 +2944,7 @@
                 <w:b w:val="0"/>
                 <w:i w:val="0"/>
                 <w:color w:val="1A1A1A"/>
-                <w:sz w:val="17"/>
+                <w:sz w:val="16"/>
               </w:rPr>
               <w:t>• Offshore Safety Permit (OSP)</w:t>
             </w:r>
@@ -2956,7 +2966,7 @@
                 <w:b w:val="0"/>
                 <w:i w:val="0"/>
                 <w:color w:val="1A1A1A"/>
-                <w:sz w:val="17"/>
+                <w:sz w:val="16"/>
               </w:rPr>
               <w:t>• HSE Level I, II &amp; III (OSHA) — HSETrain Intl., 2020</w:t>
             </w:r>
@@ -2976,7 +2986,7 @@
                 <w:b w:val="0"/>
                 <w:i w:val="0"/>
                 <w:color w:val="1A1A1A"/>
-                <w:sz w:val="17"/>
+                <w:sz w:val="16"/>
               </w:rPr>
               <w:t>• QHSE, Risk &amp; Sustainability Mgmt — IE Safetainability, 2024</w:t>
             </w:r>
@@ -2996,7 +3006,7 @@
                 <w:b w:val="0"/>
                 <w:i w:val="0"/>
                 <w:color w:val="1A1A1A"/>
-                <w:sz w:val="17"/>
+                <w:sz w:val="16"/>
               </w:rPr>
               <w:t>• Basic Instrumentation &amp; Control — Kufman Technical, 2020</w:t>
             </w:r>
@@ -3018,7 +3028,7 @@
                 <w:b w:val="0"/>
                 <w:i w:val="0"/>
                 <w:color w:val="1A1A1A"/>
-                <w:sz w:val="17"/>
+                <w:sz w:val="16"/>
               </w:rPr>
               <w:t>• Basic Rigging &amp; Scaffolding — HSETrain Intl., 2020</w:t>
             </w:r>
@@ -3038,7 +3048,7 @@
                 <w:b w:val="0"/>
                 <w:i w:val="0"/>
                 <w:color w:val="1A1A1A"/>
-                <w:sz w:val="17"/>
+                <w:sz w:val="16"/>
               </w:rPr>
               <w:t>• IBM AI Engineering — applied to failure prediction, 2023</w:t>
             </w:r>
@@ -3058,7 +3068,7 @@
                 <w:b w:val="0"/>
                 <w:i w:val="0"/>
                 <w:color w:val="1A1A1A"/>
-                <w:sz w:val="17"/>
+                <w:sz w:val="16"/>
               </w:rPr>
               <w:t>• Generative AI &amp; Agents — Johns Hopkins University, 2026</w:t>
             </w:r>
@@ -3124,7 +3134,7 @@
                 <w:b w:val="0"/>
                 <w:i w:val="0"/>
                 <w:color w:val="1A1A1A"/>
-                <w:sz w:val="17"/>
+                <w:sz w:val="16"/>
               </w:rPr>
               <w:t>• American Society for Quality (ASQ), 2024</w:t>
             </w:r>
@@ -3144,7 +3154,7 @@
                 <w:b w:val="0"/>
                 <w:i w:val="0"/>
                 <w:color w:val="1A1A1A"/>
-                <w:sz w:val="17"/>
+                <w:sz w:val="16"/>
               </w:rPr>
               <w:t>• Society of Petroleum Engineers (SPE), 2022</w:t>
             </w:r>
@@ -3164,7 +3174,7 @@
                 <w:b w:val="0"/>
                 <w:i w:val="0"/>
                 <w:color w:val="1A1A1A"/>
-                <w:sz w:val="17"/>
+                <w:sz w:val="16"/>
               </w:rPr>
               <w:t>• American Society of Mechanical Engineers (ASME), 2021</w:t>
             </w:r>
@@ -3186,7 +3196,7 @@
                 <w:b w:val="0"/>
                 <w:i w:val="0"/>
                 <w:color w:val="1A1A1A"/>
-                <w:sz w:val="17"/>
+                <w:sz w:val="16"/>
               </w:rPr>
               <w:t>• COREN Registered Engineer, 2019</w:t>
             </w:r>
@@ -3206,7 +3216,7 @@
                 <w:b w:val="0"/>
                 <w:i w:val="0"/>
                 <w:color w:val="1A1A1A"/>
-                <w:sz w:val="17"/>
+                <w:sz w:val="16"/>
               </w:rPr>
               <w:t>• Nigerian Society of Engineers (NSE), 2017</w:t>
             </w:r>
@@ -3226,7 +3236,7 @@
                 <w:b w:val="0"/>
                 <w:i w:val="0"/>
                 <w:color w:val="1A1A1A"/>
-                <w:sz w:val="17"/>
+                <w:sz w:val="16"/>
               </w:rPr>
               <w:t>• Safety Advocate of the Year — FIPL, 2023</w:t>
             </w:r>
@@ -3248,7 +3258,7 @@
                 <w:b w:val="0"/>
                 <w:i w:val="0"/>
                 <w:color w:val="1A1A1A"/>
-                <w:sz w:val="17"/>
+                <w:sz w:val="16"/>
               </w:rPr>
               <w:t>• Safety Sentinel Award — FIPL Trans-Amadi, 2023</w:t>
             </w:r>
@@ -3268,7 +3278,7 @@
                 <w:b w:val="0"/>
                 <w:i w:val="0"/>
                 <w:color w:val="1A1A1A"/>
-                <w:sz w:val="17"/>
+                <w:sz w:val="16"/>
               </w:rPr>
               <w:t>• 1st Runner-Up — Sahara Group Innovation Hackathon, 2020</w:t>
             </w:r>
@@ -3288,7 +3298,7 @@
                 <w:b w:val="0"/>
                 <w:i w:val="0"/>
                 <w:color w:val="1A1A1A"/>
-                <w:sz w:val="17"/>
+                <w:sz w:val="16"/>
               </w:rPr>
               <w:t>• Chairman's Recognition for Innovation — Sahara Group, 2019</w:t>
             </w:r>
@@ -3354,7 +3364,7 @@
                 <w:b w:val="0"/>
                 <w:i w:val="0"/>
                 <w:color w:val="1A1A1A"/>
-                <w:sz w:val="17"/>
+                <w:sz w:val="16"/>
               </w:rPr>
               <w:t>• Date of birth: 25 September 1988</w:t>
             </w:r>
@@ -3374,7 +3384,7 @@
                 <w:b w:val="0"/>
                 <w:i w:val="0"/>
                 <w:color w:val="1A1A1A"/>
-                <w:sz w:val="17"/>
+                <w:sz w:val="16"/>
               </w:rPr>
               <w:t>• Nationality: Nigerian</w:t>
             </w:r>
@@ -3394,7 +3404,7 @@
                 <w:b w:val="0"/>
                 <w:i w:val="0"/>
                 <w:color w:val="1A1A1A"/>
-                <w:sz w:val="17"/>
+                <w:sz w:val="16"/>
               </w:rPr>
               <w:t>• Passport: valid — on request</w:t>
             </w:r>

</xml_diff>

<commit_message>
Correct the role title and the lube-oil finding
The Oso role is Machinery Engineer, not a machinery/reliability lead, so the
profile, the experience entry and the cover letter all say so, and the entry
now reads as engineering support across the three assets rather than as an
authority over them.

The lube-oil item was a ten-year high filter clog rate that he identified and
is still closing out, not a resolved thirty-year contamination problem. Both
documents now credit the discovery and describe the run-down tank flushing as
in progress.

Co-Authored-By: Claude Opus 5 <noreply@anthropic.com>
Claude-Session: https://claude.ai/code/session_013H3AMzMWzEerJx7AeqeVQp
</commit_message>
<xml_diff>
--- a/AZODO_EMEKA_CV_Rotating_Equipment_Engineer_QatarEnergyLNG_no_passport.docx
+++ b/AZODO_EMEKA_CV_Rotating_Equipment_Engineer_QatarEnergyLNG_no_passport.docx
@@ -151,7 +151,7 @@
           <w:color w:val="1A1A1A"/>
           <w:sz w:val="18"/>
         </w:rPr>
-        <w:t>Machinery &amp; Reliability Lead for the Oso Gas Hub</w:t>
+        <w:t>Machinery Engineer for the Oso Gas Hub</w:t>
       </w:r>
       <w:r>
         <w:rPr>
@@ -749,7 +749,7 @@
           <w:color w:val="1A1A1A"/>
           <w:sz w:val="18"/>
         </w:rPr>
-        <w:t xml:space="preserve">Rotating equipment and reliability authority for three offshore assets; deployed February 2026 as dedicated </w:t>
+        <w:t xml:space="preserve">Provides rotating equipment and reliability engineering support across three offshore assets; deployed February 2026 as the dedicated </w:t>
       </w:r>
       <w:r>
         <w:rPr>
@@ -759,7 +759,7 @@
           <w:color w:val="1A1A1A"/>
           <w:sz w:val="18"/>
         </w:rPr>
-        <w:t>Machinery/Reliability Lead for the Oso Gas Hub</w:t>
+        <w:t>Machinery Engineer for the Oso Gas Hub</w:t>
       </w:r>
       <w:r>
         <w:rPr>
@@ -1005,7 +1005,7 @@
           <w:color w:val="1A1A1A"/>
           <w:sz w:val="18"/>
         </w:rPr>
-        <w:t>30-year lube-oil contamination problem:</w:t>
+        <w:t>10-year high filter clog rate on the lube-oil system:</w:t>
       </w:r>
       <w:r>
         <w:rPr>
@@ -1015,7 +1015,7 @@
           <w:color w:val="1A1A1A"/>
           <w:sz w:val="18"/>
         </w:rPr>
-        <w:t xml:space="preserve"> a systematic system review exposed as-built vs. as-designed discrepancies behind chronic high differential pressure, rapid filter clogging and element collapse. Introduced an elemental </w:t>
+        <w:t xml:space="preserve"> identified the problem during a systematic system review, tracing a decade of high differential pressure, rapid filter clogging and element collapse to undocumented as-built versus as-designed discrepancies. Introduced an elemental </w:t>
       </w:r>
       <w:r>
         <w:rPr>
@@ -1035,7 +1035,7 @@
           <w:color w:val="1A1A1A"/>
           <w:sz w:val="18"/>
         </w:rPr>
-        <w:t xml:space="preserve"> with node-by-node sampling to isolate the ingress zones, and coordinated the first comprehensive run-down tank flushing campaign in decades.</w:t>
+        <w:t xml:space="preserve"> with node-by-node sampling to isolate the ingress zones, and am driving close-out through dedicated run-down tank flushing.</w:t>
       </w:r>
     </w:p>
     <w:p>

</xml_diff>

<commit_message>
Add cross-platform vibration work and overhaul execution
A new bullet covers resolving vibration on pumps, diesel engines and electric
motor drivers with operations, maintenance, inspection and electrical teams
across several platforms, and the projects competency row now leads with major
overhaul planning and execution.

Paid for the additions by dropping the parenthetical glosses from the standards
row, merging the two offshore-survival certificates and the two AI courses into
single entries, and removing the rigging and scaffolding certificate. The CV
holds at three pages and the letter at one.

Co-Authored-By: Claude Opus 5 <noreply@anthropic.com>
Claude-Session: https://claude.ai/code/session_013H3AMzMWzEerJx7AeqeVQp
</commit_message>
<xml_diff>
--- a/AZODO_EMEKA_CV_Rotating_Equipment_Engineer_QatarEnergyLNG_no_passport.docx
+++ b/AZODO_EMEKA_CV_Rotating_Equipment_Engineer_QatarEnergyLNG_no_passport.docx
@@ -501,7 +501,7 @@
                 <w:color w:val="12304F"/>
                 <w:sz w:val="16"/>
               </w:rPr>
-              <w:t>Projects, MOC &amp; Commissioning</w:t>
+              <w:t>Projects, Overhauls &amp; Commissioning</w:t>
             </w:r>
           </w:p>
         </w:tc>
@@ -521,7 +521,7 @@
                 <w:color w:val="1A1A1A"/>
                 <w:sz w:val="16"/>
               </w:rPr>
-              <w:t>Technical review of vendor/engineering documents, data sheets and deviations • Machinery FAT/SAT witnessing • Pre-commissioning, commissioning and start-up support • PSSR development and execution • Brownfield modification and capacity-expansion support (120 → 240 MMSCFD)</w:t>
+              <w:t>Major overhaul planning and execution — gas and steam turbines, compressors, pumps, engines • Technical review of vendor/engineering documents, data sheets and deviations • Machinery FAT/SAT witnessing • Pre-commissioning, commissioning and start-up support • PSSR development and execution • Brownfield modification and capacity-expansion support (120 → 240 MMSCFD)</w:t>
             </w:r>
           </w:p>
         </w:tc>
@@ -605,7 +605,7 @@
                 <w:color w:val="1A1A1A"/>
                 <w:sz w:val="16"/>
               </w:rPr>
-              <w:t>API 610 (centrifugal pumps) • API 614 (lubrication, shaft-sealing and control-oil systems) • API 617 (axial and centrifugal compressors) • ASME PTC-22 (gas turbine performance testing) • ISO 10816 / 20816 (vibration evaluation)</w:t>
+              <w:t>API 610 • API 614 • API 617 • ASME PTC-22 • ISO 10816 / 20816</w:t>
             </w:r>
           </w:p>
         </w:tc>
@@ -1168,6 +1168,44 @@
           <w:sz w:val="18"/>
         </w:rPr>
         <w:t xml:space="preserve"> resolved a long-standing vibration problem on a safety-critical package and validated performance against pump-curve criteria during deliverability testing.</w:t>
+      </w:r>
+    </w:p>
+    <w:p>
+      <w:pPr>
+        <w:pStyle w:val="ListBullet"/>
+        <w:spacing w:before="0" w:after="24" w:line="240" w:lineRule="auto"/>
+        <w:ind w:left="283"/>
+        <w:jc w:val="both"/>
+      </w:pPr>
+      <w:r>
+        <w:rPr>
+          <w:rFonts w:ascii="Calibri" w:hAnsi="Calibri"/>
+          <w:b w:val="0"/>
+          <w:i w:val="0"/>
+          <w:color w:val="1A1A1A"/>
+          <w:sz w:val="18"/>
+        </w:rPr>
+        <w:t xml:space="preserve">Work with operations, maintenance, inspection and electrical teams to resolve </w:t>
+      </w:r>
+      <w:r>
+        <w:rPr>
+          <w:rFonts w:ascii="Calibri" w:hAnsi="Calibri"/>
+          <w:b/>
+          <w:i w:val="0"/>
+          <w:color w:val="1A1A1A"/>
+          <w:sz w:val="18"/>
+        </w:rPr>
+        <w:t>machinery vibration problems across pumps, diesel engines and electric motor drivers</w:t>
+      </w:r>
+      <w:r>
+        <w:rPr>
+          <w:rFonts w:ascii="Calibri" w:hAnsi="Calibri"/>
+          <w:b w:val="0"/>
+          <w:i w:val="0"/>
+          <w:color w:val="1A1A1A"/>
+          <w:sz w:val="18"/>
+        </w:rPr>
+        <w:t xml:space="preserve"> on several offshore platforms and onshore plants — field diagnosis through spectra, phase and alignment checks, corrective action, and post-repair verification against ISO limits.</w:t>
       </w:r>
     </w:p>
     <w:p>
@@ -2926,32 +2964,10 @@
                 <w:color w:val="1A1A1A"/>
                 <w:sz w:val="16"/>
               </w:rPr>
-              <w:t>• BOSIET with CA-EBS — valid to 2029</w:t>
+              <w:t>• BOSIET with CA-EBS (2029) &amp; Offshore Safety Permit (OSP)</w:t>
             </w:r>
           </w:p>
         </w:tc>
-        <w:tc>
-          <w:tcPr>
-            <w:tcW w:type="dxa" w:w="3288"/>
-          </w:tcPr>
-          <w:p>
-            <w:pPr>
-              <w:spacing w:before="0" w:after="20" w:line="240" w:lineRule="auto"/>
-            </w:pPr>
-            <w:r>
-              <w:rPr>
-                <w:rFonts w:ascii="Calibri" w:hAnsi="Calibri"/>
-                <w:b w:val="0"/>
-                <w:i w:val="0"/>
-                <w:color w:val="1A1A1A"/>
-                <w:sz w:val="16"/>
-              </w:rPr>
-              <w:t>• Offshore Safety Permit (OSP)</w:t>
-            </w:r>
-          </w:p>
-        </w:tc>
-      </w:tr>
-      <w:tr>
         <w:tc>
           <w:tcPr>
             <w:tcW w:type="dxa" w:w="3288"/>
@@ -2972,6 +2988,8 @@
             </w:r>
           </w:p>
         </w:tc>
+      </w:tr>
+      <w:tr>
         <w:tc>
           <w:tcPr>
             <w:tcW w:type="dxa" w:w="3288"/>
@@ -3012,8 +3030,6 @@
             </w:r>
           </w:p>
         </w:tc>
-      </w:tr>
-      <w:tr>
         <w:tc>
           <w:tcPr>
             <w:tcW w:type="dxa" w:w="3288"/>
@@ -3030,47 +3046,7 @@
                 <w:color w:val="1A1A1A"/>
                 <w:sz w:val="16"/>
               </w:rPr>
-              <w:t>• Basic Rigging &amp; Scaffolding — HSETrain Intl., 2020</w:t>
-            </w:r>
-          </w:p>
-        </w:tc>
-        <w:tc>
-          <w:tcPr>
-            <w:tcW w:type="dxa" w:w="3288"/>
-          </w:tcPr>
-          <w:p>
-            <w:pPr>
-              <w:spacing w:before="0" w:after="20" w:line="240" w:lineRule="auto"/>
-            </w:pPr>
-            <w:r>
-              <w:rPr>
-                <w:rFonts w:ascii="Calibri" w:hAnsi="Calibri"/>
-                <w:b w:val="0"/>
-                <w:i w:val="0"/>
-                <w:color w:val="1A1A1A"/>
-                <w:sz w:val="16"/>
-              </w:rPr>
-              <w:t>• IBM AI Engineering — applied to failure prediction, 2023</w:t>
-            </w:r>
-          </w:p>
-        </w:tc>
-        <w:tc>
-          <w:tcPr>
-            <w:tcW w:type="dxa" w:w="3288"/>
-          </w:tcPr>
-          <w:p>
-            <w:pPr>
-              <w:spacing w:before="0" w:after="20" w:line="240" w:lineRule="auto"/>
-            </w:pPr>
-            <w:r>
-              <w:rPr>
-                <w:rFonts w:ascii="Calibri" w:hAnsi="Calibri"/>
-                <w:b w:val="0"/>
-                <w:i w:val="0"/>
-                <w:color w:val="1A1A1A"/>
-                <w:sz w:val="16"/>
-              </w:rPr>
-              <w:t>• Generative AI &amp; Agents — Johns Hopkins University, 2026</w:t>
+              <w:t>• IBM AI Engineering, 2023 &amp; Generative AI and Agents — Johns Hopkins, 2026</w:t>
             </w:r>
           </w:p>
         </w:tc>

</xml_diff>

<commit_message>
Make the gas-industry continuity explicit across the FIPL years
The application form asks for six years in an oil and gas environment, and the
CV framed the decade at FIPL simply as power generation, which understated the
gas connection. The profile now names associated gas gathering alongside gas
processing and NGL, the FIPL entry says the plants are fired on natural and
associated gas, and the Imo River AGG start-up is identified as an upstream
associated-gas facility.

Dropped the closing profile sentence repeating the CRE and vibration
credentials, which the header already carries, to hold three pages.

Co-Authored-By: Claude Opus 5 <noreply@anthropic.com>
Claude-Session: https://claude.ai/code/session_013H3AMzMWzEerJx7AeqeVQp
</commit_message>
<xml_diff>
--- a/AZODO_EMEKA_CV_Rotating_Equipment_Engineer_QatarEnergyLNG_no_passport.docx
+++ b/AZODO_EMEKA_CV_Rotating_Equipment_Engineer_QatarEnergyLNG_no_passport.docx
@@ -141,7 +141,7 @@
           <w:color w:val="1A1A1A"/>
           <w:sz w:val="18"/>
         </w:rPr>
-        <w:t xml:space="preserve"> in rotating equipment engineering across offshore gas processing, LNG/NGL trains and gas-fired power generation — currently the </w:t>
+        <w:t xml:space="preserve"> in rotating equipment engineering across offshore gas processing, NGL trains, associated gas gathering and gas-fired power generation — currently the </w:t>
       </w:r>
       <w:r>
         <w:rPr>
@@ -261,7 +261,7 @@
           <w:color w:val="1A1A1A"/>
           <w:sz w:val="18"/>
         </w:rPr>
-        <w:t>. ASQ Certified Reliability Engineer and Category I vibration analyst.</w:t>
+        <w:t>.</w:t>
       </w:r>
     </w:p>
     <w:p>
@@ -1499,7 +1499,7 @@
           <w:color w:val="3F4A54"/>
           <w:sz w:val="17"/>
         </w:rPr>
-        <w:t>First Independent Power Limited (FIPL) / Sahara Power Group — multi-site gas turbine power generation</w:t>
+        <w:t>First Independent Power Limited (FIPL) / Sahara Power Group — multi-site gas turbine power generation fired on natural and associated gas</w:t>
       </w:r>
     </w:p>
     <w:p>
@@ -1641,7 +1641,7 @@
           <w:color w:val="1A1A1A"/>
           <w:sz w:val="18"/>
         </w:rPr>
-        <w:t>Lead Mechanical/Reliability Engineer for the Imo River Associated Gas Gathering (AGG) plant start-up</w:t>
+        <w:t>Lead Mechanical/Reliability Engineer for the start-up of the Imo River Associated Gas Gathering (AGG) plant</w:t>
       </w:r>
       <w:r>
         <w:rPr>
@@ -1651,7 +1651,7 @@
           <w:color w:val="1A1A1A"/>
           <w:sz w:val="18"/>
         </w:rPr>
-        <w:t xml:space="preserve"> — pre-commissioning checks, machinery alignment/verification, first-fire and load-up support.</w:t>
+        <w:t>, an upstream associated-gas facility — pre-commissioning checks, machinery alignment and verification, first fire and load-up support.</w:t>
       </w:r>
     </w:p>
     <w:p>

</xml_diff>